<commit_message>
Stellenbeschreibungen um Qualifikation/Mindestanforderungen ergänzen
Einheitliche Struktur für alle drei Stellenbeschreibungen (Produktionsleiter,
QS, PQB): zusätzliche Abschnitte "Qualifikation" und "Mindestanforderungen"
nach Kompetenzen bzw. Aufgaben. Inhalt als Platzhalter markiert, da die
konkreten Anforderungen noch mit Alexander abzustimmen sind.

Co-Authored-By: Claude Sonnet 5 <noreply@anthropic.com>
Claude-Session: https://claude.ai/code/session_01RGUMW1xe7QmP9yunCbCqHi
</commit_message>
<xml_diff>
--- a/stellenbeschreibungen/Stellenbeschreibung_PQB_ENTWURF.docx
+++ b/stellenbeschreibungen/Stellenbeschreibung_PQB_ENTWURF.docx
@@ -296,6 +296,66 @@
           <w:szCs w:val="22"/>
         </w:rPr>
         <w:t xml:space="preserve">Erneute Freigabe nach Produktionsunterbrechung</w:t>
+      </w:r>
+    </w:p>
+    <w:p>
+      <w:pPr>
+        <w:pStyle w:val="Heading2"/>
+        <w:spacing w:after="120" w:before="280"/>
+      </w:pPr>
+      <w:r>
+        <w:rPr>
+          <w:rFonts w:ascii="Calibri" w:cs="Calibri" w:eastAsia="Calibri" w:hAnsi="Calibri"/>
+          <w:b/>
+          <w:bCs/>
+        </w:rPr>
+        <w:t xml:space="preserve">Qualifikation</w:t>
+      </w:r>
+    </w:p>
+    <w:p>
+      <w:pPr>
+        <w:spacing w:after="160"/>
+      </w:pPr>
+      <w:r>
+        <w:rPr>
+          <w:rFonts w:ascii="Calibri" w:cs="Calibri" w:eastAsia="Calibri" w:hAnsi="Calibri"/>
+          <w:i/>
+          <w:iCs/>
+          <w:color w:val="5C6169"/>
+          <w:sz w:val="20"/>
+          <w:szCs w:val="20"/>
+        </w:rPr>
+        <w:t xml:space="preserve">Platzhalter – Ausbildung, Berufserfahrung, fachliche Qualifikation noch mit Alexander abzustimmen.</w:t>
+      </w:r>
+    </w:p>
+    <w:p>
+      <w:pPr>
+        <w:pStyle w:val="Heading2"/>
+        <w:spacing w:after="120" w:before="280"/>
+      </w:pPr>
+      <w:r>
+        <w:rPr>
+          <w:rFonts w:ascii="Calibri" w:cs="Calibri" w:eastAsia="Calibri" w:hAnsi="Calibri"/>
+          <w:b/>
+          <w:bCs/>
+        </w:rPr>
+        <w:t xml:space="preserve">Mindestanforderungen</w:t>
+      </w:r>
+    </w:p>
+    <w:p>
+      <w:pPr>
+        <w:spacing w:after="160"/>
+      </w:pPr>
+      <w:r>
+        <w:rPr>
+          <w:rFonts w:ascii="Calibri" w:cs="Calibri" w:eastAsia="Calibri" w:hAnsi="Calibri"/>
+          <w:i/>
+          <w:iCs/>
+          <w:color w:val="5C6169"/>
+          <w:sz w:val="20"/>
+          <w:szCs w:val="20"/>
+        </w:rPr>
+        <w:t xml:space="preserve">Platzhalter – Mindestvoraussetzungen (z. B. Kenntnisse, Zertifikate, Erfahrung) noch mit Alexander abzustimmen.</w:t>
       </w:r>
     </w:p>
     <w:sectPr>

</xml_diff>